<commit_message>
Update thesis registration document with revisions and enhancements
</commit_message>
<xml_diff>
--- a/Planilla de inscripción de Tesis.docx
+++ b/Planilla de inscripción de Tesis.docx
@@ -818,10 +818,17 @@
                 <w:rFonts w:hint="default"/>
                 <w:lang w:val="en-US"/>
               </w:rPr>
-              <w:t>Enfoques neuro-simbólicos para el aprendizaje de modelos de lenguaje.</w:t>
+              <w:t>Enfoques neuro-simbólicos para el entendimiento de intenciones</w:t>
             </w:r>
             <w:bookmarkStart w:id="0" w:name="_GoBack"/>
             <w:bookmarkEnd w:id="0"/>
+            <w:r>
+              <w:rPr>
+                <w:rFonts w:hint="default"/>
+                <w:lang w:val="en-US"/>
+              </w:rPr>
+              <w:t xml:space="preserve"> de modelos de lenguaje.</w:t>
+            </w:r>
           </w:p>
         </w:tc>
         <w:tc>
@@ -852,12 +859,6 @@
             <w:insideH w:val="single" w:color="auto" w:sz="4" w:space="0"/>
             <w:insideV w:val="single" w:color="auto" w:sz="4" w:space="0"/>
           </w:tblBorders>
-          <w:tblCellMar>
-            <w:top w:w="0" w:type="dxa"/>
-            <w:left w:w="108" w:type="dxa"/>
-            <w:bottom w:w="0" w:type="dxa"/>
-            <w:right w:w="108" w:type="dxa"/>
-          </w:tblCellMar>
         </w:tblPrEx>
         <w:tc>
           <w:tcPr>
@@ -1106,12 +1107,6 @@
             <w:insideH w:val="single" w:color="auto" w:sz="4" w:space="0"/>
             <w:insideV w:val="single" w:color="auto" w:sz="4" w:space="0"/>
           </w:tblBorders>
-          <w:tblCellMar>
-            <w:top w:w="0" w:type="dxa"/>
-            <w:left w:w="108" w:type="dxa"/>
-            <w:bottom w:w="0" w:type="dxa"/>
-            <w:right w:w="108" w:type="dxa"/>
-          </w:tblCellMar>
         </w:tblPrEx>
         <w:tc>
           <w:tcPr>
@@ -1464,7 +1459,7 @@
     <w:lsdException w:unhideWhenUsed="0" w:uiPriority="0" w:semiHidden="0" w:name="table of authorities"/>
     <w:lsdException w:unhideWhenUsed="0" w:uiPriority="0" w:semiHidden="0" w:name="macro"/>
     <w:lsdException w:unhideWhenUsed="0" w:uiPriority="0" w:semiHidden="0" w:name="toa heading"/>
-    <w:lsdException w:unhideWhenUsed="0" w:uiPriority="0" w:semiHidden="0" w:name="List"/>
+    <w:lsdException w:qFormat="1" w:unhideWhenUsed="0" w:uiPriority="0" w:semiHidden="0" w:name="List"/>
     <w:lsdException w:unhideWhenUsed="0" w:uiPriority="0" w:semiHidden="0" w:name="List Bullet"/>
     <w:lsdException w:unhideWhenUsed="0" w:uiPriority="0" w:semiHidden="0" w:name="List Number"/>
     <w:lsdException w:unhideWhenUsed="0" w:uiPriority="0" w:semiHidden="0" w:name="List 2"/>
@@ -1482,8 +1477,8 @@
     <w:lsdException w:qFormat="1" w:unhideWhenUsed="0" w:uiPriority="0" w:semiHidden="0" w:name="Title"/>
     <w:lsdException w:unhideWhenUsed="0" w:uiPriority="0" w:semiHidden="0" w:name="Closing"/>
     <w:lsdException w:unhideWhenUsed="0" w:uiPriority="0" w:semiHidden="0" w:name="Signature"/>
-    <w:lsdException w:unhideWhenUsed="0" w:uiPriority="1" w:semiHidden="0" w:name="Default Paragraph Font"/>
-    <w:lsdException w:unhideWhenUsed="0" w:uiPriority="0" w:semiHidden="0" w:name="Body Text"/>
+    <w:lsdException w:qFormat="1" w:unhideWhenUsed="0" w:uiPriority="1" w:semiHidden="0" w:name="Default Paragraph Font"/>
+    <w:lsdException w:qFormat="1" w:unhideWhenUsed="0" w:uiPriority="0" w:semiHidden="0" w:name="Body Text"/>
     <w:lsdException w:unhideWhenUsed="0" w:uiPriority="0" w:semiHidden="0" w:name="Body Text Indent"/>
     <w:lsdException w:unhideWhenUsed="0" w:uiPriority="0" w:semiHidden="0" w:name="List Continue"/>
     <w:lsdException w:unhideWhenUsed="0" w:uiPriority="0" w:semiHidden="0" w:name="List Continue 2"/>
@@ -1502,7 +1497,7 @@
     <w:lsdException w:unhideWhenUsed="0" w:uiPriority="0" w:semiHidden="0" w:name="Body Text Indent 2"/>
     <w:lsdException w:unhideWhenUsed="0" w:uiPriority="0" w:semiHidden="0" w:name="Body Text Indent 3"/>
     <w:lsdException w:unhideWhenUsed="0" w:uiPriority="0" w:semiHidden="0" w:name="Block Text"/>
-    <w:lsdException w:unhideWhenUsed="0" w:uiPriority="99" w:semiHidden="0" w:name="Hyperlink"/>
+    <w:lsdException w:qFormat="1" w:unhideWhenUsed="0" w:uiPriority="99" w:semiHidden="0" w:name="Hyperlink"/>
     <w:lsdException w:unhideWhenUsed="0" w:uiPriority="0" w:semiHidden="0" w:name="FollowedHyperlink"/>
     <w:lsdException w:qFormat="1" w:unhideWhenUsed="0" w:uiPriority="0" w:semiHidden="0" w:name="Strong"/>
     <w:lsdException w:qFormat="1" w:unhideWhenUsed="0" w:uiPriority="0" w:semiHidden="0" w:name="Emphasis"/>
@@ -1520,7 +1515,7 @@
     <w:lsdException w:unhideWhenUsed="0" w:uiPriority="0" w:semiHidden="0" w:name="HTML Sample"/>
     <w:lsdException w:unhideWhenUsed="0" w:uiPriority="0" w:semiHidden="0" w:name="HTML Typewriter"/>
     <w:lsdException w:unhideWhenUsed="0" w:uiPriority="0" w:semiHidden="0" w:name="HTML Variable"/>
-    <w:lsdException w:unhideWhenUsed="0" w:uiPriority="99" w:semiHidden="0" w:name="Normal Table"/>
+    <w:lsdException w:qFormat="1" w:unhideWhenUsed="0" w:uiPriority="99" w:semiHidden="0" w:name="Normal Table"/>
     <w:lsdException w:unhideWhenUsed="0" w:uiPriority="0" w:semiHidden="0" w:name="annotation subject"/>
     <w:lsdException w:unhideWhenUsed="0" w:uiPriority="0" w:semiHidden="0" w:name="Table Simple 1"/>
     <w:lsdException w:unhideWhenUsed="0" w:uiPriority="0" w:semiHidden="0" w:name="Table Simple 2"/>
@@ -1565,7 +1560,7 @@
     <w:lsdException w:unhideWhenUsed="0" w:uiPriority="0" w:semiHidden="0" w:name="Table Web 2"/>
     <w:lsdException w:unhideWhenUsed="0" w:uiPriority="0" w:semiHidden="0" w:name="Table Web 3"/>
     <w:lsdException w:unhideWhenUsed="0" w:uiPriority="0" w:semiHidden="0" w:name="Balloon Text"/>
-    <w:lsdException w:unhideWhenUsed="0" w:uiPriority="39" w:semiHidden="0" w:name="Table Grid"/>
+    <w:lsdException w:qFormat="1" w:unhideWhenUsed="0" w:uiPriority="39" w:semiHidden="0" w:name="Table Grid"/>
     <w:lsdException w:unhideWhenUsed="0" w:uiPriority="0" w:semiHidden="0" w:name="Table Theme"/>
     <w:lsdException w:unhideWhenUsed="0" w:uiPriority="60" w:semiHidden="0" w:name="Light Shading"/>
     <w:lsdException w:unhideWhenUsed="0" w:uiPriority="61" w:semiHidden="0" w:name="Light List"/>
@@ -1683,10 +1678,12 @@
   </w:style>
   <w:style w:type="character" w:default="1" w:styleId="2">
     <w:name w:val="Default Paragraph Font"/>
+    <w:qFormat/>
     <w:uiPriority w:val="1"/>
   </w:style>
   <w:style w:type="table" w:default="1" w:styleId="3">
     <w:name w:val="Normal Table"/>
+    <w:qFormat/>
     <w:uiPriority w:val="99"/>
     <w:tblPr>
       <w:tblCellMar>
@@ -1700,6 +1697,7 @@
   <w:style w:type="paragraph" w:styleId="4">
     <w:name w:val="Body Text"/>
     <w:basedOn w:val="1"/>
+    <w:qFormat/>
     <w:uiPriority w:val="0"/>
     <w:pPr>
       <w:spacing w:after="140" w:line="276" w:lineRule="auto"/>
@@ -1726,6 +1724,7 @@
   <w:style w:type="character" w:styleId="6">
     <w:name w:val="Hyperlink"/>
     <w:basedOn w:val="2"/>
+    <w:qFormat/>
     <w:uiPriority w:val="99"/>
     <w:rPr>
       <w:color w:val="0563C1"/>
@@ -1735,6 +1734,7 @@
   <w:style w:type="paragraph" w:styleId="7">
     <w:name w:val="List"/>
     <w:basedOn w:val="4"/>
+    <w:qFormat/>
     <w:uiPriority w:val="0"/>
     <w:rPr>
       <w:rFonts w:cs="Lohit Devanagari"/>
@@ -1743,6 +1743,7 @@
   <w:style w:type="table" w:styleId="8">
     <w:name w:val="Table Grid"/>
     <w:basedOn w:val="3"/>
+    <w:qFormat/>
     <w:uiPriority w:val="39"/>
     <w:tblPr>
       <w:tblBorders>

</xml_diff>